<commit_message>
docs(exports): regenerate Office files with W5 backfill feature
Architecture.docx (spec ingestion note + Sprint 3), Study-Plans.docx
(W5 block, now 23 features), WBS-Sprint-Plan.xlsx (W5 in register +
Sprint 3). Generated from updated markdown; consistency guard passed.

Co-Authored-By: Claude Opus 4.7 (1M context) <noreply@anthropic.com>
</commit_message>
<xml_diff>
--- a/docs/exports/Nexorus-ATLAS-Architecture.docx
+++ b/docs/exports/Nexorus-ATLAS-Architecture.docx
@@ -3190,6 +3190,29 @@
     </w:p>
     <w:p>
       <w:pPr>
+        <w:pStyle w:val="ListBullet"/>
+      </w:pPr>
+      <w:r>
+        <w:rPr>
+          <w:b/>
+        </w:rPr>
+        <w:t>Initial backfill (light):</w:t>
+      </w:r>
+      <w:r>
+        <w:t xml:space="preserve"> on a source's first crawl, pull the recent window it naturally exposes (RSS full feed; news-API items ≤~30 days, capped), then switch to incremental — </w:t>
+      </w:r>
+      <w:r>
+        <w:rPr>
+          <w:b/>
+        </w:rPr>
+        <w:t>no paid deep-archive access</w:t>
+      </w:r>
+      <w:r>
+        <w:t>. Snapshots are retro-computed over this window so trends aren't empty at launch (feature W5).</w:t>
+      </w:r>
+    </w:p>
+    <w:p>
+      <w:pPr>
         <w:pStyle w:val="Heading2"/>
       </w:pPr>
       <w:r>
@@ -4982,7 +5005,16 @@
         <w:t>sources</w:t>
       </w:r>
       <w:r>
-        <w:t xml:space="preserve"> registry + scheduling. Begin social connector spike (X or aggregator PoC) — time-boxed.</w:t>
+        <w:t xml:space="preserve"> registry + scheduling; </w:t>
+      </w:r>
+      <w:r>
+        <w:rPr>
+          <w:b/>
+        </w:rPr>
+        <w:t>initial light backfill</w:t>
+      </w:r>
+      <w:r>
+        <w:t xml:space="preserve"> (recent window + retro-snapshots, W5). Begin social connector spike (X or aggregator PoC) — time-boxed.</w:t>
       </w:r>
     </w:p>
     <w:p>

</xml_diff>